<commit_message>
Fix docx that Word 2007 rejects: link run properties in schema order (sz before u)
Rebuilt 3a v1; patched the 3a v0.1 preview the same way.

Co-Authored-By: Claude Opus 5.5 <noreply@anthropic.com>
Claude-Session: https://claude.ai/code/session_013xMY7jADqJsCLYm4VFjiuL
</commit_message>
<xml_diff>
--- a/docs/3a Case Studies – Topic 1.1 Environment and Resources v1.docx
+++ b/docs/3a Case Studies – Topic 1.1 Environment and Resources v1.docx
@@ -2060,8 +2060,8 @@
         <w:r>
           <w:rPr>
             <w:color w:val="1F4E99"/>
+            <w:sz w:val="15"/>
             <w:u w:val="single"/>
-            <w:sz w:val="15"/>
           </w:rPr>
           <w:t>FAPESP – The return of deforestation (2018, 2019 rates)</w:t>
         </w:r>
@@ -2084,8 +2084,8 @@
         <w:r>
           <w:rPr>
             <w:color w:val="1F4E99"/>
+            <w:sz w:val="15"/>
             <w:u w:val="single"/>
-            <w:sz w:val="15"/>
           </w:rPr>
           <w:t>eCycle/IPAM – PRODES 2021 and 2022 rates</w:t>
         </w:r>
@@ -2108,8 +2108,8 @@
         <w:r>
           <w:rPr>
             <w:color w:val="1F4E99"/>
+            <w:sz w:val="15"/>
             <w:u w:val="single"/>
-            <w:sz w:val="15"/>
           </w:rPr>
           <w:t>INPE – PRODES 2021 technical note (2020 consolidated rate)</w:t>
         </w:r>
@@ -2132,8 +2132,8 @@
         <w:r>
           <w:rPr>
             <w:color w:val="1F4E99"/>
+            <w:sz w:val="15"/>
             <w:u w:val="single"/>
-            <w:sz w:val="15"/>
           </w:rPr>
           <w:t>WWF-Brasil – 2024 rate, 30.6% fall</w:t>
         </w:r>
@@ -2156,8 +2156,8 @@
         <w:r>
           <w:rPr>
             <w:color w:val="1F4E99"/>
+            <w:sz w:val="15"/>
             <w:u w:val="single"/>
-            <w:sz w:val="15"/>
           </w:rPr>
           <w:t>Mongabay – 2025 preliminary rate</w:t>
         </w:r>
@@ -2180,8 +2180,8 @@
         <w:r>
           <w:rPr>
             <w:color w:val="1F4E99"/>
+            <w:sz w:val="15"/>
             <w:u w:val="single"/>
-            <w:sz w:val="15"/>
           </w:rPr>
           <w:t>ApexBrasil – agribusiness share of GDP</w:t>
         </w:r>
@@ -2204,8 +2204,8 @@
         <w:r>
           <w:rPr>
             <w:color w:val="1F4E99"/>
+            <w:sz w:val="15"/>
             <w:u w:val="single"/>
-            <w:sz w:val="15"/>
           </w:rPr>
           <w:t>Agriland – record beef exports H1 2024</w:t>
         </w:r>
@@ -2228,8 +2228,8 @@
         <w:r>
           <w:rPr>
             <w:color w:val="1F4E99"/>
+            <w:sz w:val="15"/>
             <w:u w:val="single"/>
-            <w:sz w:val="15"/>
           </w:rPr>
           <w:t>Solar Daily – 62% of cleared land used for cattle</w:t>
         </w:r>
@@ -2252,8 +2252,8 @@
         <w:r>
           <w:rPr>
             <w:color w:val="1F4E99"/>
+            <w:sz w:val="15"/>
             <w:u w:val="single"/>
-            <w:sz w:val="15"/>
           </w:rPr>
           <w:t>CS Monitor – illegal miners on Yanomami land</w:t>
         </w:r>
@@ -2276,8 +2276,8 @@
         <w:r>
           <w:rPr>
             <w:color w:val="1F4E99"/>
+            <w:sz w:val="15"/>
             <w:u w:val="single"/>
-            <w:sz w:val="15"/>
           </w:rPr>
           <w:t>Euronews – Yanomami child deaths, health emergency</w:t>
         </w:r>
@@ -2735,8 +2735,8 @@
         <w:r>
           <w:rPr>
             <w:color w:val="1F4E99"/>
+            <w:sz w:val="15"/>
             <w:u w:val="single"/>
-            <w:sz w:val="15"/>
           </w:rPr>
           <w:t>Wikipedia – Cape Town water crisis (dam levels 14–29%)</w:t>
         </w:r>
@@ -2759,8 +2759,8 @@
         <w:r>
           <w:rPr>
             <w:color w:val="1F4E99"/>
+            <w:sz w:val="15"/>
             <w:u w:val="single"/>
-            <w:sz w:val="15"/>
           </w:rPr>
           <w:t>News24 – Day Zero moved to 12 April; Level 6B 50 L from 1 Feb 2018</w:t>
         </w:r>
@@ -2783,8 +2783,8 @@
         <w:r>
           <w:rPr>
             <w:color w:val="1F4E99"/>
+            <w:sz w:val="15"/>
             <w:u w:val="single"/>
-            <w:sz w:val="15"/>
           </w:rPr>
           <w:t>Daily Maverick/GroundUp – use fell from 1.2 bn to 511 m L/day</w:t>
         </w:r>
@@ -2807,8 +2807,8 @@
         <w:r>
           <w:rPr>
             <w:color w:val="1F4E99"/>
+            <w:sz w:val="15"/>
             <w:u w:val="single"/>
-            <w:sz w:val="15"/>
           </w:rPr>
           <w:t>Pressreader (Cape Argus) – desalination plants on track</w:t>
         </w:r>
@@ -2831,8 +2831,8 @@
         <w:r>
           <w:rPr>
             <w:color w:val="1F4E99"/>
+            <w:sz w:val="15"/>
             <w:u w:val="single"/>
-            <w:sz w:val="15"/>
           </w:rPr>
           <w:t>SIWI – How Cape Town saved itself from Day Zero</w:t>
         </w:r>
@@ -2855,8 +2855,8 @@
         <w:r>
           <w:rPr>
             <w:color w:val="1F4E99"/>
+            <w:sz w:val="15"/>
             <w:u w:val="single"/>
-            <w:sz w:val="15"/>
           </w:rPr>
           <w:t>npj Climate &amp; Atmos. Sci. – Day Zero drought and Hadley cell expansion</w:t>
         </w:r>
@@ -2879,8 +2879,8 @@
         <w:r>
           <w:rPr>
             <w:color w:val="1F4E99"/>
+            <w:sz w:val="15"/>
             <w:u w:val="single"/>
-            <w:sz w:val="15"/>
           </w:rPr>
           <w:t>WWF – Cape Town: Avoiding Day Zero</w:t>
         </w:r>
@@ -2903,8 +2903,8 @@
         <w:r>
           <w:rPr>
             <w:color w:val="1F4E99"/>
+            <w:sz w:val="15"/>
             <w:u w:val="single"/>
-            <w:sz w:val="15"/>
           </w:rPr>
           <w:t>Business Insider – Day Zero postponements</w:t>
         </w:r>
@@ -3362,8 +3362,8 @@
         <w:r>
           <w:rPr>
             <w:color w:val="1F4E99"/>
+            <w:sz w:val="15"/>
             <w:u w:val="single"/>
-            <w:sz w:val="15"/>
           </w:rPr>
           <w:t>allAfrica – Nigeria hits 20 years without census (Jun 2026)</w:t>
         </w:r>
@@ -3386,8 +3386,8 @@
         <w:r>
           <w:rPr>
             <w:color w:val="1F4E99"/>
+            <w:sz w:val="15"/>
             <w:u w:val="single"/>
-            <w:sz w:val="15"/>
           </w:rPr>
           <w:t>Vanguard – NPC: date set by President, not in election year (Jul 2026)</w:t>
         </w:r>
@@ -3410,8 +3410,8 @@
         <w:r>
           <w:rPr>
             <w:color w:val="1F4E99"/>
+            <w:sz w:val="15"/>
             <w:u w:val="single"/>
-            <w:sz w:val="15"/>
           </w:rPr>
           <w:t>ICIR – census postponement and data accuracy</w:t>
         </w:r>
@@ -3434,8 +3434,8 @@
         <w:r>
           <w:rPr>
             <w:color w:val="1F4E99"/>
+            <w:sz w:val="15"/>
             <w:u w:val="single"/>
-            <w:sz w:val="15"/>
           </w:rPr>
           <w:t>Daily Maverick – census delayed to May, first in 17 years</w:t>
         </w:r>
@@ -3458,8 +3458,8 @@
         <w:r>
           <w:rPr>
             <w:color w:val="1F4E99"/>
+            <w:sz w:val="15"/>
             <w:u w:val="single"/>
-            <w:sz w:val="15"/>
           </w:rPr>
           <w:t>Zikoko – UN vs World Bank population estimates</w:t>
         </w:r>
@@ -3482,8 +3482,8 @@
         <w:r>
           <w:rPr>
             <w:color w:val="1F4E99"/>
+            <w:sz w:val="15"/>
             <w:u w:val="single"/>
-            <w:sz w:val="15"/>
           </w:rPr>
           <w:t>Africa Check – no confirmed census date</w:t>
         </w:r>
@@ -3506,8 +3506,8 @@
         <w:r>
           <w:rPr>
             <w:color w:val="1F4E99"/>
+            <w:sz w:val="15"/>
             <w:u w:val="single"/>
-            <w:sz w:val="15"/>
           </w:rPr>
           <w:t>Bloomberg – GDP rises to ₦372.8 trillion after rebasing</w:t>
         </w:r>
@@ -3530,8 +3530,8 @@
         <w:r>
           <w:rPr>
             <w:color w:val="1F4E99"/>
+            <w:sz w:val="15"/>
             <w:u w:val="single"/>
-            <w:sz w:val="15"/>
           </w:rPr>
           <w:t>Channels TV – GDP rebased, 41.7% revision</w:t>
         </w:r>
@@ -3554,8 +3554,8 @@
         <w:r>
           <w:rPr>
             <w:color w:val="1F4E99"/>
+            <w:sz w:val="15"/>
             <w:u w:val="single"/>
-            <w:sz w:val="15"/>
           </w:rPr>
           <w:t>Techeconomy – what to know about NBS rebasing (46 industries, 217 products)</w:t>
         </w:r>
@@ -4013,8 +4013,8 @@
         <w:r>
           <w:rPr>
             <w:color w:val="1F4E99"/>
+            <w:sz w:val="15"/>
             <w:u w:val="single"/>
-            <w:sz w:val="15"/>
           </w:rPr>
           <w:t>Al Jazeera – Sri Lanka crisis: how did we get here</w:t>
         </w:r>
@@ -4037,8 +4037,8 @@
         <w:r>
           <w:rPr>
             <w:color w:val="1F4E99"/>
+            <w:sz w:val="15"/>
             <w:u w:val="single"/>
-            <w:sz w:val="15"/>
           </w:rPr>
           <w:t>Euronews – Sri Lanka crisis factors (tax cuts, downgrades)</w:t>
         </w:r>
@@ -4061,8 +4061,8 @@
         <w:r>
           <w:rPr>
             <w:color w:val="1F4E99"/>
+            <w:sz w:val="15"/>
             <w:u w:val="single"/>
-            <w:sz w:val="15"/>
           </w:rPr>
           <w:t>Dawn – How Sri Lanka spiralled into crisis</w:t>
         </w:r>
@@ -4085,8 +4085,8 @@
         <w:r>
           <w:rPr>
             <w:color w:val="1F4E99"/>
+            <w:sz w:val="15"/>
             <w:u w:val="single"/>
-            <w:sz w:val="15"/>
           </w:rPr>
           <w:t>Oman Observer – record 14% inflation, reserves US$3.1 bn</w:t>
         </w:r>
@@ -4109,8 +4109,8 @@
         <w:r>
           <w:rPr>
             <w:color w:val="1F4E99"/>
+            <w:sz w:val="15"/>
             <w:u w:val="single"/>
-            <w:sz w:val="15"/>
           </w:rPr>
           <w:t>Al Jazeera – food crisis, fertiliser ban and rice output</w:t>
         </w:r>
@@ -4133,8 +4133,8 @@
         <w:r>
           <w:rPr>
             <w:color w:val="1F4E99"/>
+            <w:sz w:val="15"/>
             <w:u w:val="single"/>
-            <w:sz w:val="15"/>
           </w:rPr>
           <w:t>Newsfirst – World Bank: poverty doubled to 25%</w:t>
         </w:r>
@@ -4157,8 +4157,8 @@
         <w:r>
           <w:rPr>
             <w:color w:val="1F4E99"/>
+            <w:sz w:val="15"/>
             <w:u w:val="single"/>
-            <w:sz w:val="15"/>
           </w:rPr>
           <w:t>Ada Derana – World Bank: 25.9% poverty in 2023</w:t>
         </w:r>
@@ -4616,8 +4616,8 @@
         <w:r>
           <w:rPr>
             <w:color w:val="1F4E99"/>
+            <w:sz w:val="15"/>
             <w:u w:val="single"/>
-            <w:sz w:val="15"/>
           </w:rPr>
           <w:t>EnergyTrend – lithium carbonate prices 2015–2022</w:t>
         </w:r>
@@ -4640,8 +4640,8 @@
         <w:r>
           <w:rPr>
             <w:color w:val="1F4E99"/>
+            <w:sz w:val="15"/>
             <w:u w:val="single"/>
-            <w:sz w:val="15"/>
           </w:rPr>
           <w:t>CnEVPost – lithium price fall 2023</w:t>
         </w:r>
@@ -4664,8 +4664,8 @@
         <w:r>
           <w:rPr>
             <w:color w:val="1F4E99"/>
+            <w:sz w:val="15"/>
             <w:u w:val="single"/>
-            <w:sz w:val="15"/>
           </w:rPr>
           <w:t>Kalkine Media – 2022 peak to 2023 prices</w:t>
         </w:r>
@@ -4688,8 +4688,8 @@
         <w:r>
           <w:rPr>
             <w:color w:val="1F4E99"/>
+            <w:sz w:val="15"/>
             <w:u w:val="single"/>
-            <w:sz w:val="15"/>
           </w:rPr>
           <w:t>FastForward – Lithium Triangle resources (USGS 2026)</w:t>
         </w:r>
@@ -4712,8 +4712,8 @@
         <w:r>
           <w:rPr>
             <w:color w:val="1F4E99"/>
+            <w:sz w:val="15"/>
             <w:u w:val="single"/>
-            <w:sz w:val="15"/>
           </w:rPr>
           <w:t>Undark – Chile's debate over lithium brine</w:t>
         </w:r>
@@ -4736,8 +4736,8 @@
         <w:r>
           <w:rPr>
             <w:color w:val="1F4E99"/>
+            <w:sz w:val="15"/>
             <w:u w:val="single"/>
-            <w:sz w:val="15"/>
           </w:rPr>
           <w:t>Wikipedia – Salar de Atacama (Likan Antay, lagoons)</w:t>
         </w:r>
@@ -5195,8 +5195,8 @@
         <w:r>
           <w:rPr>
             <w:color w:val="1F4E99"/>
+            <w:sz w:val="15"/>
             <w:u w:val="single"/>
-            <w:sz w:val="15"/>
           </w:rPr>
           <w:t>BenarNews – fires cost US$16.1 bn (World Bank)</w:t>
         </w:r>
@@ -5219,8 +5219,8 @@
         <w:r>
           <w:rPr>
             <w:color w:val="1F4E99"/>
+            <w:sz w:val="15"/>
             <w:u w:val="single"/>
-            <w:sz w:val="15"/>
           </w:rPr>
           <w:t>World Bank – The Cost of Fire (knowledge note)</w:t>
         </w:r>
@@ -5243,8 +5243,8 @@
         <w:r>
           <w:rPr>
             <w:color w:val="1F4E99"/>
+            <w:sz w:val="15"/>
             <w:u w:val="single"/>
-            <w:sz w:val="15"/>
           </w:rPr>
           <w:t>Eco-Business – can Indonesia avoid a repeat of 2015 (100,000 deaths)</w:t>
         </w:r>
@@ -5267,8 +5267,8 @@
         <w:r>
           <w:rPr>
             <w:color w:val="1F4E99"/>
+            <w:sz w:val="15"/>
             <w:u w:val="single"/>
-            <w:sz w:val="15"/>
           </w:rPr>
           <w:t>World Bank blog – peat fires and emissions</w:t>
         </w:r>
@@ -5291,8 +5291,8 @@
         <w:r>
           <w:rPr>
             <w:color w:val="1F4E99"/>
+            <w:sz w:val="15"/>
             <w:u w:val="single"/>
-            <w:sz w:val="15"/>
           </w:rPr>
           <w:t>SMU – legal study: nearly 1 Gt of GHGs; PSI days</w:t>
         </w:r>
@@ -5750,8 +5750,8 @@
         <w:r>
           <w:rPr>
             <w:color w:val="1F4E99"/>
+            <w:sz w:val="15"/>
             <w:u w:val="single"/>
-            <w:sz w:val="15"/>
           </w:rPr>
           <w:t>CFFA – round sardinella further declining (2017 survey)</w:t>
         </w:r>
@@ -5774,8 +5774,8 @@
         <w:r>
           <w:rPr>
             <w:color w:val="1F4E99"/>
+            <w:sz w:val="15"/>
             <w:u w:val="single"/>
-            <w:sz w:val="15"/>
           </w:rPr>
           <w:t>CFFA – Mauritania: sardinella overexploited since 2007</w:t>
         </w:r>
@@ -5798,8 +5798,8 @@
         <w:r>
           <w:rPr>
             <w:color w:val="1F4E99"/>
+            <w:sz w:val="15"/>
             <w:u w:val="single"/>
-            <w:sz w:val="15"/>
           </w:rPr>
           <w:t>Africanews – Greenpeace on fishmeal (tenfold, 500,000 t)</w:t>
         </w:r>
@@ -5822,8 +5822,8 @@
         <w:r>
           <w:rPr>
             <w:color w:val="1F4E99"/>
+            <w:sz w:val="15"/>
             <w:u w:val="single"/>
-            <w:sz w:val="15"/>
           </w:rPr>
           <w:t>ADF – fishmeal industry depletes West African waters</w:t>
         </w:r>
@@ -5846,8 +5846,8 @@
         <w:r>
           <w:rPr>
             <w:color w:val="1F4E99"/>
+            <w:sz w:val="15"/>
             <w:u w:val="single"/>
-            <w:sz w:val="15"/>
           </w:rPr>
           <w:t>Yale e360 – foreign trawlers drive migration (EJF)</w:t>
         </w:r>
@@ -5870,8 +5870,8 @@
         <w:r>
           <w:rPr>
             <w:color w:val="1F4E99"/>
+            <w:sz w:val="15"/>
             <w:u w:val="single"/>
-            <w:sz w:val="15"/>
           </w:rPr>
           <w:t>Africanews – Senegal's fishing crisis (2025)</w:t>
         </w:r>
@@ -6329,8 +6329,8 @@
         <w:r>
           <w:rPr>
             <w:color w:val="1F4E99"/>
+            <w:sz w:val="15"/>
             <w:u w:val="single"/>
-            <w:sz w:val="15"/>
           </w:rPr>
           <w:t>Wikipedia – Rice production in Bangladesh (39.1 Mt, 2023)</w:t>
         </w:r>
@@ -6353,8 +6353,8 @@
         <w:r>
           <w:rPr>
             <w:color w:val="1F4E99"/>
+            <w:sz w:val="15"/>
             <w:u w:val="single"/>
-            <w:sz w:val="15"/>
           </w:rPr>
           <w:t>Kyoto University – rice output 35 Mt (2015–16)</w:t>
         </w:r>
@@ -6377,8 +6377,8 @@
         <w:r>
           <w:rPr>
             <w:color w:val="1F4E99"/>
+            <w:sz w:val="15"/>
             <w:u w:val="single"/>
-            <w:sz w:val="15"/>
           </w:rPr>
           <w:t>Bangladesh Rice Journal – BRRI dhan67 salinity tolerance</w:t>
         </w:r>
@@ -6401,8 +6401,8 @@
         <w:r>
           <w:rPr>
             <w:color w:val="1F4E99"/>
+            <w:sz w:val="15"/>
             <w:u w:val="single"/>
-            <w:sz w:val="15"/>
           </w:rPr>
           <w:t>Bangladesh Rice Journal – drought-tolerant varieties</w:t>
         </w:r>
@@ -6425,8 +6425,8 @@
         <w:r>
           <w:rPr>
             <w:color w:val="1F4E99"/>
+            <w:sz w:val="15"/>
             <w:u w:val="single"/>
-            <w:sz w:val="15"/>
           </w:rPr>
           <w:t>Dialogue Earth – Nachole water table 3.5 m to 25 m</w:t>
         </w:r>
@@ -6449,8 +6449,8 @@
         <w:r>
           <w:rPr>
             <w:color w:val="1F4E99"/>
+            <w:sz w:val="15"/>
             <w:u w:val="single"/>
-            <w:sz w:val="15"/>
           </w:rPr>
           <w:t>Mongabay – food security vs groundwater (Dec 2025)</w:t>
         </w:r>
@@ -6473,8 +6473,8 @@
         <w:r>
           <w:rPr>
             <w:color w:val="1F4E99"/>
+            <w:sz w:val="15"/>
             <w:u w:val="single"/>
-            <w:sz w:val="15"/>
           </w:rPr>
           <w:t>TBS News – stunting fell to 24% (BDHS 2022)</w:t>
         </w:r>
@@ -6497,8 +6497,8 @@
         <w:r>
           <w:rPr>
             <w:color w:val="1F4E99"/>
+            <w:sz w:val="15"/>
             <w:u w:val="single"/>
-            <w:sz w:val="15"/>
           </w:rPr>
           <w:t>Financial Express – population 169.8 million</w:t>
         </w:r>
@@ -6956,8 +6956,8 @@
         <w:r>
           <w:rPr>
             <w:color w:val="1F4E99"/>
+            <w:sz w:val="15"/>
             <w:u w:val="single"/>
-            <w:sz w:val="15"/>
           </w:rPr>
           <w:t>PV Tech – FiT rush, 5.5 GW forecast for 2019</w:t>
         </w:r>
@@ -6980,8 +6980,8 @@
         <w:r>
           <w:rPr>
             <w:color w:val="1F4E99"/>
+            <w:sz w:val="15"/>
             <w:u w:val="single"/>
-            <w:sz w:val="15"/>
           </w:rPr>
           <w:t>ISEAS – 16,500 MW at end-2020</w:t>
         </w:r>
@@ -7004,8 +7004,8 @@
         <w:r>
           <w:rPr>
             <w:color w:val="1F4E99"/>
+            <w:sz w:val="15"/>
             <w:u w:val="single"/>
-            <w:sz w:val="15"/>
           </w:rPr>
           <w:t>Policy Forum – next steps for Vietnam's solar (curtailment)</w:t>
         </w:r>
@@ -7028,8 +7028,8 @@
         <w:r>
           <w:rPr>
             <w:color w:val="1F4E99"/>
+            <w:sz w:val="15"/>
             <w:u w:val="single"/>
-            <w:sz w:val="15"/>
           </w:rPr>
           <w:t>Conventus Law – FiTs successful but challenges (2019)</w:t>
         </w:r>
@@ -7052,8 +7052,8 @@
         <w:r>
           <w:rPr>
             <w:color w:val="1F4E99"/>
+            <w:sz w:val="15"/>
             <w:u w:val="single"/>
-            <w:sz w:val="15"/>
           </w:rPr>
           <w:t>Tuoi Tre – rooftop tariff cut to ease grid</w:t>
         </w:r>
@@ -7076,8 +7076,8 @@
         <w:r>
           <w:rPr>
             <w:color w:val="1F4E99"/>
+            <w:sz w:val="15"/>
             <w:u w:val="single"/>
-            <w:sz w:val="15"/>
           </w:rPr>
           <w:t>The Investor – transitional projects and EVN (2023)</w:t>
         </w:r>
@@ -7535,8 +7535,8 @@
         <w:r>
           <w:rPr>
             <w:color w:val="1F4E99"/>
+            <w:sz w:val="15"/>
             <w:u w:val="single"/>
-            <w:sz w:val="15"/>
           </w:rPr>
           <w:t>World Politics Review – Laos bet big on China-backed dams</w:t>
         </w:r>
@@ -7559,8 +7559,8 @@
         <w:r>
           <w:rPr>
             <w:color w:val="1F4E99"/>
+            <w:sz w:val="15"/>
             <w:u w:val="single"/>
-            <w:sz w:val="15"/>
           </w:rPr>
           <w:t>RFA – citizens say rates remain too high; debt</w:t>
         </w:r>
@@ -7583,8 +7583,8 @@
         <w:r>
           <w:rPr>
             <w:color w:val="1F4E99"/>
+            <w:sz w:val="15"/>
             <w:u w:val="single"/>
-            <w:sz w:val="15"/>
           </w:rPr>
           <w:t>Water Power Magazine – exports surge (surplus figures)</w:t>
         </w:r>
@@ -7607,8 +7607,8 @@
         <w:r>
           <w:rPr>
             <w:color w:val="1F4E99"/>
+            <w:sz w:val="15"/>
             <w:u w:val="single"/>
-            <w:sz w:val="15"/>
           </w:rPr>
           <w:t>SEAsia – more electricity than it can sell (2026)</w:t>
         </w:r>
@@ -7631,8 +7631,8 @@
         <w:r>
           <w:rPr>
             <w:color w:val="1F4E99"/>
+            <w:sz w:val="15"/>
             <w:u w:val="single"/>
-            <w:sz w:val="15"/>
           </w:rPr>
           <w:t>Vietnam News – hundreds missing after dam collapse</w:t>
         </w:r>
@@ -7655,8 +7655,8 @@
         <w:r>
           <w:rPr>
             <w:color w:val="1F4E99"/>
+            <w:sz w:val="15"/>
             <w:u w:val="single"/>
-            <w:sz w:val="15"/>
           </w:rPr>
           <w:t>The ASEAN Post – survivors homeless a year on</w:t>
         </w:r>
@@ -7679,8 +7679,8 @@
         <w:r>
           <w:rPr>
             <w:color w:val="1F4E99"/>
+            <w:sz w:val="15"/>
             <w:u w:val="single"/>
-            <w:sz w:val="15"/>
           </w:rPr>
           <w:t>VOA – groups urge Laos to rethink hydropower</w:t>
         </w:r>
@@ -8138,8 +8138,8 @@
         <w:r>
           <w:rPr>
             <w:color w:val="1F4E99"/>
+            <w:sz w:val="15"/>
             <w:u w:val="single"/>
-            <w:sz w:val="15"/>
           </w:rPr>
           <w:t>Stimson – New evidence: how China turned off the Mekong's tap</w:t>
         </w:r>
@@ -8162,8 +8162,8 @@
         <w:r>
           <w:rPr>
             <w:color w:val="1F4E99"/>
+            <w:sz w:val="15"/>
             <w:u w:val="single"/>
-            <w:sz w:val="15"/>
           </w:rPr>
           <w:t>Al Jazeera – China's dams exacerbated extreme drought</w:t>
         </w:r>
@@ -8186,8 +8186,8 @@
         <w:r>
           <w:rPr>
             <w:color w:val="1F4E99"/>
+            <w:sz w:val="15"/>
             <w:u w:val="single"/>
-            <w:sz w:val="15"/>
           </w:rPr>
           <w:t>Lowy Institute – Chinese dams and the Mekong drought</w:t>
         </w:r>
@@ -8210,8 +8210,8 @@
         <w:r>
           <w:rPr>
             <w:color w:val="1F4E99"/>
+            <w:sz w:val="15"/>
             <w:u w:val="single"/>
-            <w:sz w:val="15"/>
           </w:rPr>
           <w:t>Khaosod English – US study insists China's dams to blame</w:t>
         </w:r>
@@ -8669,8 +8669,8 @@
         <w:r>
           <w:rPr>
             <w:color w:val="1F4E99"/>
+            <w:sz w:val="15"/>
             <w:u w:val="single"/>
-            <w:sz w:val="15"/>
           </w:rPr>
           <w:t>Interfax – memorandum on Kambarata-1, stakes</w:t>
         </w:r>
@@ -8693,8 +8693,8 @@
         <w:r>
           <w:rPr>
             <w:color w:val="1F4E99"/>
+            <w:sz w:val="15"/>
             <w:u w:val="single"/>
-            <w:sz w:val="15"/>
           </w:rPr>
           <w:t>Interfax – Jan 2025 key principles agreed</w:t>
         </w:r>
@@ -8717,8 +8717,8 @@
         <w:r>
           <w:rPr>
             <w:color w:val="1F4E99"/>
+            <w:sz w:val="15"/>
             <w:u w:val="single"/>
-            <w:sz w:val="15"/>
           </w:rPr>
           <w:t>Times of Central Asia – US$4.2 bn Kambarata-1 project</w:t>
         </w:r>
@@ -8741,8 +8741,8 @@
         <w:r>
           <w:rPr>
             <w:color w:val="1F4E99"/>
+            <w:sz w:val="15"/>
             <w:u w:val="single"/>
-            <w:sz w:val="15"/>
           </w:rPr>
           <w:t>World Bank – Kambarata-1 FAQs</w:t>
         </w:r>
@@ -8765,8 +8765,8 @@
         <w:r>
           <w:rPr>
             <w:color w:val="1F4E99"/>
+            <w:sz w:val="15"/>
             <w:u w:val="single"/>
-            <w:sz w:val="15"/>
           </w:rPr>
           <w:t>Defense Post – Uzbekistan: no more Rogun dam problems (2018)</w:t>
         </w:r>
@@ -8789,8 +8789,8 @@
         <w:r>
           <w:rPr>
             <w:color w:val="1F4E99"/>
+            <w:sz w:val="15"/>
             <w:u w:val="single"/>
-            <w:sz w:val="15"/>
           </w:rPr>
           <w:t>Times of Central Asia – steps to end dam impasse</w:t>
         </w:r>
@@ -9248,8 +9248,8 @@
         <w:r>
           <w:rPr>
             <w:color w:val="1F4E99"/>
+            <w:sz w:val="15"/>
             <w:u w:val="single"/>
-            <w:sz w:val="15"/>
           </w:rPr>
           <w:t>Al Jazeera – does India's treaty freeze threaten Pakistan?</w:t>
         </w:r>
@@ -9272,8 +9272,8 @@
         <w:r>
           <w:rPr>
             <w:color w:val="1F4E99"/>
+            <w:sz w:val="15"/>
             <w:u w:val="single"/>
-            <w:sz w:val="15"/>
           </w:rPr>
           <w:t>Scroll – Pakistan calls suspension 'act of war'</w:t>
         </w:r>
@@ -9296,8 +9296,8 @@
         <w:r>
           <w:rPr>
             <w:color w:val="1F4E99"/>
+            <w:sz w:val="15"/>
             <w:u w:val="single"/>
-            <w:sz w:val="15"/>
           </w:rPr>
           <w:t>Business Today – India: can't be expected to cooperate</w:t>
         </w:r>
@@ -9320,8 +9320,8 @@
         <w:r>
           <w:rPr>
             <w:color w:val="1F4E99"/>
+            <w:sz w:val="15"/>
             <w:u w:val="single"/>
-            <w:sz w:val="15"/>
           </w:rPr>
           <w:t>ASIL – Court of Arbitration: treaty remains in force</w:t>
         </w:r>
@@ -9344,8 +9344,8 @@
         <w:r>
           <w:rPr>
             <w:color w:val="1F4E99"/>
+            <w:sz w:val="15"/>
             <w:u w:val="single"/>
-            <w:sz w:val="15"/>
           </w:rPr>
           <w:t>The Week – India rejects ruling, treaty in abeyance (Aug 2026)</w:t>
         </w:r>
@@ -9803,8 +9803,8 @@
         <w:r>
           <w:rPr>
             <w:color w:val="1F4E99"/>
+            <w:sz w:val="15"/>
             <w:u w:val="single"/>
-            <w:sz w:val="15"/>
           </w:rPr>
           <w:t>NS Energy – underground project US$7.06 bn capex</w:t>
         </w:r>
@@ -9827,8 +9827,8 @@
         <w:r>
           <w:rPr>
             <w:color w:val="1F4E99"/>
+            <w:sz w:val="15"/>
             <w:u w:val="single"/>
-            <w:sz w:val="15"/>
           </w:rPr>
           <w:t>Mining.com – stakes high for Rio Tinto and Mongolia (66/34)</w:t>
         </w:r>
@@ -9851,8 +9851,8 @@
         <w:r>
           <w:rPr>
             <w:color w:val="1F4E99"/>
+            <w:sz w:val="15"/>
             <w:u w:val="single"/>
-            <w:sz w:val="15"/>
           </w:rPr>
           <w:t>Mining Technology – underground production starts</w:t>
         </w:r>
@@ -9875,8 +9875,8 @@
         <w:r>
           <w:rPr>
             <w:color w:val="1F4E99"/>
+            <w:sz w:val="15"/>
             <w:u w:val="single"/>
-            <w:sz w:val="15"/>
           </w:rPr>
           <w:t>Mining Technology – Oyu Tolgoi costs</w:t>
         </w:r>
@@ -9899,8 +9899,8 @@
         <w:r>
           <w:rPr>
             <w:color w:val="1F4E99"/>
+            <w:sz w:val="15"/>
             <w:u w:val="single"/>
-            <w:sz w:val="15"/>
           </w:rPr>
           <w:t>IMWA 2026 – Oyu Tolgoi water use and recycling</w:t>
         </w:r>
@@ -9923,8 +9923,8 @@
         <w:r>
           <w:rPr>
             <w:color w:val="1F4E99"/>
+            <w:sz w:val="15"/>
             <w:u w:val="single"/>
-            <w:sz w:val="15"/>
           </w:rPr>
           <w:t>IFC – Oyu Tolgoi environmental and social review</w:t>
         </w:r>
@@ -9947,8 +9947,8 @@
         <w:r>
           <w:rPr>
             <w:color w:val="1F4E99"/>
+            <w:sz w:val="15"/>
             <w:u w:val="single"/>
-            <w:sz w:val="15"/>
           </w:rPr>
           <w:t>Truthout – mine endangers nomads' water</w:t>
         </w:r>
@@ -10406,8 +10406,8 @@
         <w:r>
           <w:rPr>
             <w:color w:val="1F4E99"/>
+            <w:sz w:val="15"/>
             <w:u w:val="single"/>
-            <w:sz w:val="15"/>
           </w:rPr>
           <w:t>CNBC – Guyana could grow 100% in five years</w:t>
         </w:r>
@@ -10430,8 +10430,8 @@
         <w:r>
           <w:rPr>
             <w:color w:val="1F4E99"/>
+            <w:sz w:val="15"/>
             <w:u w:val="single"/>
-            <w:sz w:val="15"/>
           </w:rPr>
           <w:t>EIA – Guyana country brief 2024 (output)</w:t>
         </w:r>
@@ -10454,8 +10454,8 @@
         <w:r>
           <w:rPr>
             <w:color w:val="1F4E99"/>
+            <w:sz w:val="15"/>
             <w:u w:val="single"/>
-            <w:sz w:val="15"/>
           </w:rPr>
           <w:t>IMF – 2023 Article IV (economy tripled)</w:t>
         </w:r>
@@ -10478,8 +10478,8 @@
         <w:r>
           <w:rPr>
             <w:color w:val="1F4E99"/>
+            <w:sz w:val="15"/>
             <w:u w:val="single"/>
-            <w:sz w:val="15"/>
           </w:rPr>
           <w:t>OilNOW – court reverses unlimited guarantee order</w:t>
         </w:r>
@@ -10502,8 +10502,8 @@
         <w:r>
           <w:rPr>
             <w:color w:val="1F4E99"/>
+            <w:sz w:val="15"/>
             <w:u w:val="single"/>
-            <w:sz w:val="15"/>
           </w:rPr>
           <w:t>Global Americans – poverty 48.4% (2019)</w:t>
         </w:r>
@@ -10526,8 +10526,8 @@
         <w:r>
           <w:rPr>
             <w:color w:val="1F4E99"/>
+            <w:sz w:val="15"/>
             <w:u w:val="single"/>
-            <w:sz w:val="15"/>
           </w:rPr>
           <w:t>VON – 4,919 spills in 6 years</w:t>
         </w:r>
@@ -10550,8 +10550,8 @@
         <w:r>
           <w:rPr>
             <w:color w:val="1F4E99"/>
+            <w:sz w:val="15"/>
             <w:u w:val="single"/>
-            <w:sz w:val="15"/>
           </w:rPr>
           <w:t>Guardian Nigeria – 589 spills in 2024</w:t>
         </w:r>
@@ -10574,8 +10574,8 @@
         <w:r>
           <w:rPr>
             <w:color w:val="1F4E99"/>
+            <w:sz w:val="15"/>
             <w:u w:val="single"/>
-            <w:sz w:val="15"/>
           </w:rPr>
           <w:t>Amnesty – Bodo community's case (2025)</w:t>
         </w:r>
@@ -11033,8 +11033,8 @@
         <w:r>
           <w:rPr>
             <w:color w:val="1F4E99"/>
+            <w:sz w:val="15"/>
             <w:u w:val="single"/>
-            <w:sz w:val="15"/>
           </w:rPr>
           <w:t>AgMetalMiner – ban moved up to start of 2020</w:t>
         </w:r>
@@ -11057,8 +11057,8 @@
         <w:r>
           <w:rPr>
             <w:color w:val="1F4E99"/>
+            <w:sz w:val="15"/>
             <w:u w:val="single"/>
-            <w:sz w:val="15"/>
           </w:rPr>
           <w:t>Phenomenal World – exports US$6 bn to ~US$30 bn</w:t>
         </w:r>
@@ -11081,8 +11081,8 @@
         <w:r>
           <w:rPr>
             <w:color w:val="1F4E99"/>
+            <w:sz w:val="15"/>
             <w:u w:val="single"/>
-            <w:sz w:val="15"/>
           </w:rPr>
           <w:t>East Asia Forum – Indonesia doubles down on export bans</w:t>
         </w:r>
@@ -11105,8 +11105,8 @@
         <w:r>
           <w:rPr>
             <w:color w:val="1F4E99"/>
+            <w:sz w:val="15"/>
             <w:u w:val="single"/>
-            <w:sz w:val="15"/>
           </w:rPr>
           <w:t>GIS Reports – value added US$1.4 bn to US$34.8 bn</w:t>
         </w:r>
@@ -11129,8 +11129,8 @@
         <w:r>
           <w:rPr>
             <w:color w:val="1F4E99"/>
+            <w:sz w:val="15"/>
             <w:u w:val="single"/>
-            <w:sz w:val="15"/>
           </w:rPr>
           <w:t>The Conversation – is downstreaming questionable?</w:t>
         </w:r>
@@ -11153,8 +11153,8 @@
         <w:r>
           <w:rPr>
             <w:color w:val="1F4E99"/>
+            <w:sz w:val="15"/>
             <w:u w:val="single"/>
-            <w:sz w:val="15"/>
           </w:rPr>
           <w:t>Fortune – local smelters struggle (2025)</w:t>
         </w:r>
@@ -11612,8 +11612,8 @@
         <w:r>
           <w:rPr>
             <w:color w:val="1F4E99"/>
+            <w:sz w:val="15"/>
             <w:u w:val="single"/>
-            <w:sz w:val="15"/>
           </w:rPr>
           <w:t>Al Jazeera – Vale reaches US$7 bn settlement</w:t>
         </w:r>
@@ -11636,8 +11636,8 @@
         <w:r>
           <w:rPr>
             <w:color w:val="1F4E99"/>
+            <w:sz w:val="15"/>
             <w:u w:val="single"/>
-            <w:sz w:val="15"/>
           </w:rPr>
           <w:t>Manufacturing.net (AP) – settlement; Mariana 2015</w:t>
         </w:r>
@@ -11660,8 +11660,8 @@
         <w:r>
           <w:rPr>
             <w:color w:val="1F4E99"/>
+            <w:sz w:val="15"/>
             <w:u w:val="single"/>
-            <w:sz w:val="15"/>
           </w:rPr>
           <w:t>The Chemical Engineer – US$7.02 bn settlement, 270 dead</w:t>
         </w:r>
@@ -11684,8 +11684,8 @@
         <w:r>
           <w:rPr>
             <w:color w:val="1F4E99"/>
+            <w:sz w:val="15"/>
             <w:u w:val="single"/>
-            <w:sz w:val="15"/>
           </w:rPr>
           <w:t>Mining Journal – Brazil bans upstream tailings dams</w:t>
         </w:r>
@@ -11708,8 +11708,8 @@
         <w:r>
           <w:rPr>
             <w:color w:val="1F4E99"/>
+            <w:sz w:val="15"/>
             <w:u w:val="single"/>
-            <w:sz w:val="15"/>
           </w:rPr>
           <w:t>Mining Technology – Brazil extends dam closure deadlines (Vale: 23 dams, not before 2035)</w:t>
         </w:r>

</xml_diff>